<commit_message>
fix: replace hardcoded dates and numbers in FORTUNEI templates with placeholders
</commit_message>
<xml_diff>
--- a/public/templates-clean/fortunei/1. Cerere de admitere.docx
+++ b/public/templates-clean/fortunei/1. Cerere de admitere.docx
@@ -90,25 +90,25 @@
         <w:rPr>
           <w:sz w:val="18"/>
         </w:rPr>
-        <w:t>Nr.</w:t>
+        <w:t>Nr.{NUMAR_CERERE}/{DATA_CONTRACT}</w:t>
       </w:r>
       <w:r>
         <w:rPr>
           <w:sz w:val="18"/>
         </w:rPr>
-        <w:t>2</w:t>
+        <w:t/>
       </w:r>
       <w:r>
         <w:rPr>
           <w:sz w:val="18"/>
         </w:rPr>
-        <w:t>60</w:t>
+        <w:t/>
       </w:r>
       <w:r>
         <w:rPr>
           <w:sz w:val="18"/>
         </w:rPr>
-        <w:t>/{DATA_CONTRACT}</w:t>
+        <w:t/>
       </w:r>
       <w:r>
         <w:rPr>
@@ -279,7 +279,7 @@
           <w:rFonts w:asciiTheme="majorHAnsi" w:hAnsiTheme="majorHAnsi" w:cstheme="minorHAnsi"/>
           <w:w w:val="115"/>
         </w:rPr>
-        <w:t xml:space="preserve"> </w:t>
+        <w:t xml:space="preserve"/>
       </w:r>
       <w:bookmarkStart w:id="1" w:name="_Hlk200288673"/>
       <w:r>
@@ -372,7 +372,7 @@
         <w:rPr>
           <w:rFonts w:ascii="Times New Roman" w:eastAsia="Times New Roman" w:hAnsi="Times New Roman" w:cs="Times New Roman"/>
         </w:rPr>
-        <w:t>{BENEFICIAR_CI_ELIBERAT_DE}</w:t>
+        <w:t>{BENEFICIAR_CI_ELIBERAT_DE}, cu domiciliul în România, {BENEFICIAR_ADRESA}</w:t>
       </w:r>
       <w:r>
         <w:rPr>
@@ -384,50 +384,50 @@
         <w:rPr>
           <w:rFonts w:ascii="Times New Roman" w:eastAsia="Times New Roman" w:hAnsi="Times New Roman" w:cs="Times New Roman"/>
         </w:rPr>
-        <w:t xml:space="preserve">, cu </w:t>
-      </w:r>
-      <w:r>
-        <w:rPr>
-          <w:rFonts w:ascii="Times New Roman" w:eastAsia="Times New Roman" w:hAnsi="Times New Roman" w:cs="Times New Roman"/>
-        </w:rPr>
-        <w:t>domicili</w:t>
-      </w:r>
-      <w:r>
-        <w:rPr>
-          <w:rFonts w:ascii="Times New Roman" w:eastAsia="Times New Roman" w:hAnsi="Times New Roman" w:cs="Times New Roman"/>
-        </w:rPr>
-        <w:t>ul</w:t>
-      </w:r>
-      <w:r>
-        <w:rPr>
-          <w:rFonts w:ascii="Times New Roman" w:eastAsia="Times New Roman" w:hAnsi="Times New Roman" w:cs="Times New Roman"/>
-        </w:rPr>
-        <w:t xml:space="preserve"> </w:t>
-      </w:r>
-      <w:r>
-        <w:rPr>
-          <w:rFonts w:ascii="Times New Roman" w:eastAsia="Times New Roman" w:hAnsi="Times New Roman" w:cs="Times New Roman"/>
-        </w:rPr>
-        <w:t>în Rom</w:t>
-      </w:r>
-      <w:r>
-        <w:rPr>
-          <w:rFonts w:ascii="Times New Roman" w:eastAsia="Times New Roman" w:hAnsi="Times New Roman" w:cs="Times New Roman"/>
-        </w:rPr>
-        <w:t>â</w:t>
-      </w:r>
-      <w:r>
-        <w:rPr>
-          <w:rFonts w:ascii="Times New Roman" w:eastAsia="Times New Roman" w:hAnsi="Times New Roman" w:cs="Times New Roman"/>
-        </w:rPr>
-        <w:t xml:space="preserve">nia, </w:t>
+        <w:t xml:space="preserve"/>
+      </w:r>
+      <w:r>
+        <w:rPr>
+          <w:rFonts w:ascii="Times New Roman" w:eastAsia="Times New Roman" w:hAnsi="Times New Roman" w:cs="Times New Roman"/>
+        </w:rPr>
+        <w:t/>
+      </w:r>
+      <w:r>
+        <w:rPr>
+          <w:rFonts w:ascii="Times New Roman" w:eastAsia="Times New Roman" w:hAnsi="Times New Roman" w:cs="Times New Roman"/>
+        </w:rPr>
+        <w:t/>
+      </w:r>
+      <w:r>
+        <w:rPr>
+          <w:rFonts w:ascii="Times New Roman" w:eastAsia="Times New Roman" w:hAnsi="Times New Roman" w:cs="Times New Roman"/>
+        </w:rPr>
+        <w:t xml:space="preserve"> </w:t>
+      </w:r>
+      <w:r>
+        <w:rPr>
+          <w:rFonts w:ascii="Times New Roman" w:eastAsia="Times New Roman" w:hAnsi="Times New Roman" w:cs="Times New Roman"/>
+        </w:rPr>
+        <w:t/>
+      </w:r>
+      <w:r>
+        <w:rPr>
+          <w:rFonts w:ascii="Times New Roman" w:eastAsia="Times New Roman" w:hAnsi="Times New Roman" w:cs="Times New Roman"/>
+        </w:rPr>
+        <w:t/>
+      </w:r>
+      <w:r>
+        <w:rPr>
+          <w:rFonts w:ascii="Times New Roman" w:eastAsia="Times New Roman" w:hAnsi="Times New Roman" w:cs="Times New Roman"/>
+        </w:rPr>
+        <w:t xml:space="preserve"/>
       </w:r>
       <w:bookmarkStart w:id="2" w:name="_Hlk200288009"/>
       <w:r>
         <w:rPr>
           <w:rFonts w:ascii="Times New Roman" w:eastAsia="Times New Roman" w:hAnsi="Times New Roman" w:cs="Times New Roman"/>
         </w:rPr>
-        <w:t xml:space="preserve">{APARTINATOR_ADRESA}</w:t>
+        <w:t xml:space="preserve"/>
       </w:r>
       <w:r>
         <w:rPr>
@@ -609,13 +609,13 @@
         <w:rPr>
           <w:rFonts w:ascii="Times New Roman" w:eastAsia="Times New Roman" w:hAnsi="Times New Roman" w:cs="Times New Roman"/>
         </w:rPr>
-        <w:t xml:space="preserve"> NR </w:t>
-      </w:r>
-      <w:r>
-        <w:rPr>
-          <w:rFonts w:ascii="Times New Roman" w:eastAsia="Times New Roman" w:hAnsi="Times New Roman" w:cs="Times New Roman"/>
-        </w:rPr>
-        <w:t>037720</w:t>
+        <w:t xml:space="preserve"> nr. {APARTINATOR_CI_NUMAR}</w:t>
+      </w:r>
+      <w:r>
+        <w:rPr>
+          <w:rFonts w:ascii="Times New Roman" w:eastAsia="Times New Roman" w:hAnsi="Times New Roman" w:cs="Times New Roman"/>
+        </w:rPr>
+        <w:t/>
       </w:r>
       <w:r>
         <w:rPr>
@@ -1113,31 +1113,31 @@
           <w:b/>
           <w:w w:val="115"/>
         </w:rPr>
-        <w:t>07.0</w:t>
-      </w:r>
-      <w:r>
-        <w:rPr>
-          <w:rFonts w:asciiTheme="majorHAnsi" w:hAnsiTheme="majorHAnsi"/>
-          <w:b/>
-          <w:w w:val="115"/>
-        </w:rPr>
-        <w:t>6</w:t>
-      </w:r>
-      <w:r>
-        <w:rPr>
-          <w:rFonts w:asciiTheme="majorHAnsi" w:hAnsiTheme="majorHAnsi"/>
-          <w:b/>
-          <w:w w:val="115"/>
-        </w:rPr>
-        <w:t>.202</w:t>
-      </w:r>
-      <w:r>
-        <w:rPr>
-          <w:rFonts w:asciiTheme="majorHAnsi" w:hAnsiTheme="majorHAnsi"/>
-          <w:b/>
-          <w:w w:val="115"/>
-        </w:rPr>
-        <w:t>6</w:t>
+        <w:t>{DATA_CONTRACT}</w:t>
+      </w:r>
+      <w:r>
+        <w:rPr>
+          <w:rFonts w:asciiTheme="majorHAnsi" w:hAnsiTheme="majorHAnsi"/>
+          <w:b/>
+          <w:w w:val="115"/>
+        </w:rPr>
+        <w:t/>
+      </w:r>
+      <w:r>
+        <w:rPr>
+          <w:rFonts w:asciiTheme="majorHAnsi" w:hAnsiTheme="majorHAnsi"/>
+          <w:b/>
+          <w:w w:val="115"/>
+        </w:rPr>
+        <w:t/>
+      </w:r>
+      <w:r>
+        <w:rPr>
+          <w:rFonts w:asciiTheme="majorHAnsi" w:hAnsiTheme="majorHAnsi"/>
+          <w:b/>
+          <w:w w:val="115"/>
+        </w:rPr>
+        <w:t/>
       </w:r>
       <w:r>
         <w:rPr>

</xml_diff>